<commit_message>
Fix Monaco theme flicker, simulator Space key, and update docs
- Unify all Monaco instances to vs-dark theme (FunctionEditor + Simulator
  input) — prevents global theme state fighting when both panels are visible
- Add onKeyDown stopPropagation to simulator panel so ReactFlow canvas
  shortcuts (Space, Delete) don't intercept keystrokes inside Monaco
- Update README and technical doc with Monaco dual-use, keyboard isolation,
  GoRules expression quirks (underscore numerics, compound and ranges,
  field-path outputs), and function console object serialisation detail
- Regenerate Word doc from updated markdown

Co-Authored-By: Claude Sonnet 4.6 <noreply@anthropic.com>
</commit_message>
<xml_diff>
--- a/docs/BRMS_Technical_Documentation.docx
+++ b/docs/BRMS_Technical_Documentation.docx
@@ -34,32 +34,6 @@
         <w:t xml:space="preserve">2026</w:t>
       </w:r>
     </w:p>
-    <w:sdt>
-      <w:sdtPr>
-        <w:docPartObj>
-          <w:docPartGallery w:val="Table of Contents"/>
-          <w:docPartUnique/>
-        </w:docPartObj>
-      </w:sdtPr>
-      <w:sdtContent>
-        <w:p>
-          <w:pPr>
-            <w:pStyle w:val="TOCHeading"/>
-          </w:pPr>
-          <w:r>
-            <w:t xml:space="preserve">Table of Contents</w:t>
-          </w:r>
-        </w:p>
-        <w:p>
-          <w:r>
-            <w:fldChar w:fldCharType="begin" w:dirty="true"/>
-            <w:instrText xml:space="preserve">TOC \o "1-3" \h \z \u</w:instrText>
-            <w:fldChar w:fldCharType="separate"/>
-            <w:fldChar w:fldCharType="end"/>
-          </w:r>
-        </w:p>
-      </w:sdtContent>
-    </w:sdt>
     <w:bookmarkStart w:id="11" w:name="introduction"/>
     <w:p>
       <w:pPr>
@@ -728,7 +702,104 @@
         <w:pStyle w:val="FirstParagraph"/>
       </w:pPr>
       <w:r>
-        <w:t xml:space="preserve">Monaco Editor (the same engine as VS Code) is embedded inside Function node editors. It provides syntax highlighting, auto-completion, and error markers for the JavaScript code that users write in function nodes.</w:t>
+        <w:t xml:space="preserve">Monaco Editor (the same engine as VS Code) is embedded in two places:</w:t>
+      </w:r>
+    </w:p>
+    <w:p>
+      <w:pPr>
+        <w:pStyle w:val="Compact"/>
+        <w:numPr>
+          <w:ilvl w:val="0"/>
+          <w:numId w:val="1002"/>
+        </w:numPr>
+      </w:pPr>
+      <w:r>
+        <w:rPr>
+          <w:b/>
+          <w:bCs/>
+        </w:rPr>
+        <w:t xml:space="preserve">Function node editor</w:t>
+      </w:r>
+      <w:r>
+        <w:t xml:space="preserve"> </w:t>
+      </w:r>
+      <w:r>
+        <w:t xml:space="preserve">— JavaScript with syntax highlighting, auto-completion, and error markers.</w:t>
+      </w:r>
+    </w:p>
+    <w:p>
+      <w:pPr>
+        <w:pStyle w:val="Compact"/>
+        <w:numPr>
+          <w:ilvl w:val="0"/>
+          <w:numId w:val="1002"/>
+        </w:numPr>
+      </w:pPr>
+      <w:r>
+        <w:rPr>
+          <w:b/>
+          <w:bCs/>
+        </w:rPr>
+        <w:t xml:space="preserve">Simulator input panel</w:t>
+      </w:r>
+      <w:r>
+        <w:t xml:space="preserve"> </w:t>
+      </w:r>
+      <w:r>
+        <w:t xml:space="preserve">— JSON editor for crafting test inputs.</w:t>
+      </w:r>
+    </w:p>
+    <w:p>
+      <w:pPr>
+        <w:pStyle w:val="FirstParagraph"/>
+      </w:pPr>
+      <w:r>
+        <w:t xml:space="preserve">All Monaco instances use a consistent</w:t>
+      </w:r>
+      <w:r>
+        <w:t xml:space="preserve"> </w:t>
+      </w:r>
+      <w:r>
+        <w:rPr>
+          <w:rStyle w:val="VerbatimChar"/>
+        </w:rPr>
+        <w:t xml:space="preserve">vs-dark</w:t>
+      </w:r>
+      <w:r>
+        <w:t xml:space="preserve"> </w:t>
+      </w:r>
+      <w:r>
+        <w:t xml:space="preserve">theme. Because Monaco exposes a single global theme state, mixing light and dark themes across instances causes erratic flickering; keeping them uniform eliminates this. Both panels also call</w:t>
+      </w:r>
+      <w:r>
+        <w:t xml:space="preserve"> </w:t>
+      </w:r>
+      <w:r>
+        <w:rPr>
+          <w:rStyle w:val="VerbatimChar"/>
+        </w:rPr>
+        <w:t xml:space="preserve">stopPropagation</w:t>
+      </w:r>
+      <w:r>
+        <w:t xml:space="preserve"> </w:t>
+      </w:r>
+      <w:r>
+        <w:t xml:space="preserve">on</w:t>
+      </w:r>
+      <w:r>
+        <w:t xml:space="preserve"> </w:t>
+      </w:r>
+      <w:r>
+        <w:rPr>
+          <w:rStyle w:val="VerbatimChar"/>
+        </w:rPr>
+        <w:t xml:space="preserve">keydown</w:t>
+      </w:r>
+      <w:r>
+        <w:t xml:space="preserve"> </w:t>
+      </w:r>
+      <w:r>
+        <w:t xml:space="preserve">events so that ReactFlow’s global keyboard shortcuts (Space for pan, Delete for node removal) do not interfere with typing inside Monaco.</w:t>
       </w:r>
     </w:p>
     <w:p>
@@ -1124,7 +1195,7 @@
         <w:pStyle w:val="Compact"/>
         <w:numPr>
           <w:ilvl w:val="0"/>
-          <w:numId w:val="1002"/>
+          <w:numId w:val="1003"/>
         </w:numPr>
       </w:pPr>
       <w:r>
@@ -1146,7 +1217,7 @@
         <w:pStyle w:val="Compact"/>
         <w:numPr>
           <w:ilvl w:val="0"/>
-          <w:numId w:val="1002"/>
+          <w:numId w:val="1003"/>
         </w:numPr>
       </w:pPr>
       <w:r>
@@ -1177,7 +1248,7 @@
         <w:pStyle w:val="Compact"/>
         <w:numPr>
           <w:ilvl w:val="0"/>
-          <w:numId w:val="1002"/>
+          <w:numId w:val="1003"/>
         </w:numPr>
       </w:pPr>
       <w:r>
@@ -1454,7 +1525,7 @@
       <w:pPr>
         <w:numPr>
           <w:ilvl w:val="0"/>
-          <w:numId w:val="1003"/>
+          <w:numId w:val="1004"/>
         </w:numPr>
       </w:pPr>
       <w:r>
@@ -1480,7 +1551,7 @@
       <w:pPr>
         <w:numPr>
           <w:ilvl w:val="0"/>
-          <w:numId w:val="1003"/>
+          <w:numId w:val="1004"/>
         </w:numPr>
       </w:pPr>
       <w:r>
@@ -1521,7 +1592,7 @@
       <w:pPr>
         <w:numPr>
           <w:ilvl w:val="0"/>
-          <w:numId w:val="1003"/>
+          <w:numId w:val="1004"/>
         </w:numPr>
       </w:pPr>
       <w:r>
@@ -1544,7 +1615,7 @@
       <w:pPr>
         <w:numPr>
           <w:ilvl w:val="0"/>
-          <w:numId w:val="1003"/>
+          <w:numId w:val="1004"/>
         </w:numPr>
       </w:pPr>
       <w:r>
@@ -1567,7 +1638,7 @@
       <w:pPr>
         <w:numPr>
           <w:ilvl w:val="0"/>
-          <w:numId w:val="1003"/>
+          <w:numId w:val="1004"/>
         </w:numPr>
       </w:pPr>
       <w:r>
@@ -2304,7 +2375,7 @@
         <w:pStyle w:val="Compact"/>
         <w:numPr>
           <w:ilvl w:val="0"/>
-          <w:numId w:val="1004"/>
+          <w:numId w:val="1005"/>
         </w:numPr>
       </w:pPr>
       <w:r>
@@ -2316,7 +2387,7 @@
         <w:pStyle w:val="Compact"/>
         <w:numPr>
           <w:ilvl w:val="0"/>
-          <w:numId w:val="1004"/>
+          <w:numId w:val="1005"/>
         </w:numPr>
       </w:pPr>
       <w:r>
@@ -2328,7 +2399,7 @@
         <w:pStyle w:val="Compact"/>
         <w:numPr>
           <w:ilvl w:val="0"/>
-          <w:numId w:val="1004"/>
+          <w:numId w:val="1005"/>
         </w:numPr>
       </w:pPr>
       <w:r>
@@ -2340,7 +2411,7 @@
         <w:pStyle w:val="Compact"/>
         <w:numPr>
           <w:ilvl w:val="0"/>
-          <w:numId w:val="1004"/>
+          <w:numId w:val="1005"/>
         </w:numPr>
       </w:pPr>
       <w:r>
@@ -2877,6 +2948,53 @@
           </w:p>
         </w:tc>
       </w:tr>
+      <w:tr>
+        <w:tc>
+          <w:tcPr/>
+          <w:p>
+            <w:pPr>
+              <w:pStyle w:val="Compact"/>
+            </w:pPr>
+            <w:r>
+              <w:t xml:space="preserve">Compound range</w:t>
+            </w:r>
+          </w:p>
+        </w:tc>
+        <w:tc>
+          <w:tcPr/>
+          <w:p>
+            <w:pPr>
+              <w:pStyle w:val="Compact"/>
+            </w:pPr>
+            <w:r>
+              <w:rPr>
+                <w:rStyle w:val="VerbatimChar"/>
+              </w:rPr>
+              <w:t xml:space="preserve">&gt;= 25000 and &lt;= 200000</w:t>
+            </w:r>
+          </w:p>
+        </w:tc>
+        <w:tc>
+          <w:tcPr/>
+          <w:p>
+            <w:pPr>
+              <w:pStyle w:val="Compact"/>
+            </w:pPr>
+            <w:r>
+              <w:t xml:space="preserve">Two conditions joined with</w:t>
+            </w:r>
+            <w:r>
+              <w:t xml:space="preserve"> </w:t>
+            </w:r>
+            <w:r>
+              <w:rPr>
+                <w:rStyle w:val="VerbatimChar"/>
+              </w:rPr>
+              <w:t xml:space="preserve">and</w:t>
+            </w:r>
+          </w:p>
+        </w:tc>
+      </w:tr>
     </w:tbl>
     <w:p>
       <w:pPr>
@@ -2957,6 +3075,200 @@
       </w:r>
       <w:r>
         <w:t xml:space="preserve">continue through all rows.</w:t>
+      </w:r>
+    </w:p>
+    <w:p>
+      <w:pPr>
+        <w:pStyle w:val="BodyText"/>
+      </w:pPr>
+      <w:r>
+        <w:rPr>
+          <w:b/>
+          <w:bCs/>
+        </w:rPr>
+        <w:t xml:space="preserve">GoRules JDM compatibility notes</w:t>
+      </w:r>
+      <w:r>
+        <w:t xml:space="preserve"> </w:t>
+      </w:r>
+      <w:r>
+        <w:t xml:space="preserve">— when importing GoRules decision tables, the engine transparently handles three quirks:</w:t>
+      </w:r>
+    </w:p>
+    <w:p>
+      <w:pPr>
+        <w:pStyle w:val="Compact"/>
+        <w:numPr>
+          <w:ilvl w:val="0"/>
+          <w:numId w:val="1006"/>
+        </w:numPr>
+      </w:pPr>
+      <w:r>
+        <w:rPr>
+          <w:b/>
+          <w:bCs/>
+        </w:rPr>
+        <w:t xml:space="preserve">Numeric underscore separators</w:t>
+      </w:r>
+      <w:r>
+        <w:t xml:space="preserve"> </w:t>
+      </w:r>
+      <w:r>
+        <w:t xml:space="preserve">— GoRules allows</w:t>
+      </w:r>
+      <w:r>
+        <w:t xml:space="preserve"> </w:t>
+      </w:r>
+      <w:r>
+        <w:rPr>
+          <w:rStyle w:val="VerbatimChar"/>
+        </w:rPr>
+        <w:t xml:space="preserve">25_000</w:t>
+      </w:r>
+      <w:r>
+        <w:t xml:space="preserve">; the engine strips underscores before numeric comparison (</w:t>
+      </w:r>
+      <w:r>
+        <w:rPr>
+          <w:rStyle w:val="VerbatimChar"/>
+        </w:rPr>
+        <w:t xml:space="preserve">Number('25_000')</w:t>
+      </w:r>
+      <w:r>
+        <w:t xml:space="preserve"> </w:t>
+      </w:r>
+      <w:r>
+        <w:t xml:space="preserve">returns</w:t>
+      </w:r>
+      <w:r>
+        <w:t xml:space="preserve"> </w:t>
+      </w:r>
+      <w:r>
+        <w:rPr>
+          <w:rStyle w:val="VerbatimChar"/>
+        </w:rPr>
+        <w:t xml:space="preserve">NaN</w:t>
+      </w:r>
+      <w:r>
+        <w:t xml:space="preserve"> </w:t>
+      </w:r>
+      <w:r>
+        <w:t xml:space="preserve">in native JS).</w:t>
+      </w:r>
+    </w:p>
+    <w:p>
+      <w:pPr>
+        <w:pStyle w:val="Compact"/>
+        <w:numPr>
+          <w:ilvl w:val="0"/>
+          <w:numId w:val="1006"/>
+        </w:numPr>
+      </w:pPr>
+      <w:r>
+        <w:rPr>
+          <w:b/>
+          <w:bCs/>
+        </w:rPr>
+        <w:t xml:space="preserve">Compound</w:t>
+      </w:r>
+      <w:r>
+        <w:rPr>
+          <w:b/>
+          <w:bCs/>
+        </w:rPr>
+        <w:t xml:space="preserve"> </w:t>
+      </w:r>
+      <w:r>
+        <w:rPr>
+          <w:rStyle w:val="VerbatimChar"/>
+          <w:b/>
+          <w:bCs/>
+        </w:rPr>
+        <w:t xml:space="preserve">and</w:t>
+      </w:r>
+      <w:r>
+        <w:rPr>
+          <w:b/>
+          <w:bCs/>
+        </w:rPr>
+        <w:t xml:space="preserve"> </w:t>
+      </w:r>
+      <w:r>
+        <w:rPr>
+          <w:b/>
+          <w:bCs/>
+        </w:rPr>
+        <w:t xml:space="preserve">ranges</w:t>
+      </w:r>
+      <w:r>
+        <w:t xml:space="preserve"> </w:t>
+      </w:r>
+      <w:r>
+        <w:t xml:space="preserve">— expressions like</w:t>
+      </w:r>
+      <w:r>
+        <w:t xml:space="preserve"> </w:t>
+      </w:r>
+      <w:r>
+        <w:rPr>
+          <w:rStyle w:val="VerbatimChar"/>
+        </w:rPr>
+        <w:t xml:space="preserve">&gt;= 25_000 and &lt;= 200_000</w:t>
+      </w:r>
+      <w:r>
+        <w:t xml:space="preserve"> </w:t>
+      </w:r>
+      <w:r>
+        <w:t xml:space="preserve">are split on</w:t>
+      </w:r>
+      <w:r>
+        <w:t xml:space="preserve"> </w:t>
+      </w:r>
+      <w:r>
+        <w:rPr>
+          <w:rStyle w:val="VerbatimChar"/>
+        </w:rPr>
+        <w:t xml:space="preserve">and</w:t>
+      </w:r>
+      <w:r>
+        <w:t xml:space="preserve"> </w:t>
+      </w:r>
+      <w:r>
+        <w:t xml:space="preserve">and both sub-expressions must match.</w:t>
+      </w:r>
+    </w:p>
+    <w:p>
+      <w:pPr>
+        <w:pStyle w:val="Compact"/>
+        <w:numPr>
+          <w:ilvl w:val="0"/>
+          <w:numId w:val="1006"/>
+        </w:numPr>
+      </w:pPr>
+      <w:r>
+        <w:rPr>
+          <w:b/>
+          <w:bCs/>
+        </w:rPr>
+        <w:t xml:space="preserve">Field-path output values</w:t>
+      </w:r>
+      <w:r>
+        <w:t xml:space="preserve"> </w:t>
+      </w:r>
+      <w:r>
+        <w:t xml:space="preserve">— if an output cell contains a bare identifier like</w:t>
+      </w:r>
+      <w:r>
+        <w:t xml:space="preserve"> </w:t>
+      </w:r>
+      <w:r>
+        <w:rPr>
+          <w:rStyle w:val="VerbatimChar"/>
+        </w:rPr>
+        <w:t xml:space="preserve">card_variant.limit</w:t>
+      </w:r>
+      <w:r>
+        <w:t xml:space="preserve">, the engine resolves it as a field reference from the context rather than treating it as a literal string.</w:t>
       </w:r>
     </w:p>
     <w:bookmarkEnd w:id="38"/>
@@ -3662,7 +3974,68 @@
         <w:t xml:space="preserve"> </w:t>
       </w:r>
       <w:r>
-        <w:t xml:space="preserve">and returns an object. That object is deep-merged back into the context. Console output is captured and surfaced in the simulator trace.</w:t>
+        <w:t xml:space="preserve">and returns an object. That object is deep-merged back into the context. Console output is captured and surfaced both in the simulator trace and in the inline</w:t>
+      </w:r>
+      <w:r>
+        <w:t xml:space="preserve"> </w:t>
+      </w:r>
+      <w:r>
+        <w:rPr>
+          <w:b/>
+          <w:bCs/>
+        </w:rPr>
+        <w:t xml:space="preserve">Console</w:t>
+      </w:r>
+      <w:r>
+        <w:t xml:space="preserve"> </w:t>
+      </w:r>
+      <w:r>
+        <w:t xml:space="preserve">panel at the bottom of the Function node editor. Objects and arrays passed to</w:t>
+      </w:r>
+      <w:r>
+        <w:t xml:space="preserve"> </w:t>
+      </w:r>
+      <w:r>
+        <w:rPr>
+          <w:rStyle w:val="VerbatimChar"/>
+        </w:rPr>
+        <w:t xml:space="preserve">console.log()</w:t>
+      </w:r>
+      <w:r>
+        <w:t xml:space="preserve"> </w:t>
+      </w:r>
+      <w:r>
+        <w:t xml:space="preserve">are serialised with</w:t>
+      </w:r>
+      <w:r>
+        <w:t xml:space="preserve"> </w:t>
+      </w:r>
+      <w:r>
+        <w:rPr>
+          <w:rStyle w:val="VerbatimChar"/>
+        </w:rPr>
+        <w:t xml:space="preserve">JSON.stringify</w:t>
+      </w:r>
+      <w:r>
+        <w:t xml:space="preserve"> </w:t>
+      </w:r>
+      <w:r>
+        <w:t xml:space="preserve">so that</w:t>
+      </w:r>
+      <w:r>
+        <w:t xml:space="preserve"> </w:t>
+      </w:r>
+      <w:r>
+        <w:rPr>
+          <w:rStyle w:val="VerbatimChar"/>
+        </w:rPr>
+        <w:t xml:space="preserve">[object Object]</w:t>
+      </w:r>
+      <w:r>
+        <w:t xml:space="preserve"> </w:t>
+      </w:r>
+      <w:r>
+        <w:t xml:space="preserve">is never shown.</w:t>
       </w:r>
     </w:p>
     <w:bookmarkEnd w:id="39"/>
@@ -15839,7 +16212,7 @@
         <w:pStyle w:val="Compact"/>
         <w:numPr>
           <w:ilvl w:val="0"/>
-          <w:numId w:val="1005"/>
+          <w:numId w:val="1007"/>
         </w:numPr>
       </w:pPr>
       <w:r>
@@ -15878,7 +16251,7 @@
         <w:pStyle w:val="Compact"/>
         <w:numPr>
           <w:ilvl w:val="0"/>
-          <w:numId w:val="1005"/>
+          <w:numId w:val="1007"/>
         </w:numPr>
       </w:pPr>
       <w:r>
@@ -15902,7 +16275,7 @@
         <w:pStyle w:val="Compact"/>
         <w:numPr>
           <w:ilvl w:val="0"/>
-          <w:numId w:val="1005"/>
+          <w:numId w:val="1007"/>
         </w:numPr>
       </w:pPr>
       <w:r>
@@ -15941,7 +16314,7 @@
         <w:pStyle w:val="Compact"/>
         <w:numPr>
           <w:ilvl w:val="0"/>
-          <w:numId w:val="1005"/>
+          <w:numId w:val="1007"/>
         </w:numPr>
       </w:pPr>
       <w:r>
@@ -15965,7 +16338,7 @@
         <w:pStyle w:val="Compact"/>
         <w:numPr>
           <w:ilvl w:val="0"/>
-          <w:numId w:val="1005"/>
+          <w:numId w:val="1007"/>
         </w:numPr>
       </w:pPr>
       <w:r>
@@ -15989,7 +16362,7 @@
         <w:pStyle w:val="Compact"/>
         <w:numPr>
           <w:ilvl w:val="0"/>
-          <w:numId w:val="1005"/>
+          <w:numId w:val="1007"/>
         </w:numPr>
       </w:pPr>
       <w:r>
@@ -16013,7 +16386,7 @@
         <w:pStyle w:val="Compact"/>
         <w:numPr>
           <w:ilvl w:val="0"/>
-          <w:numId w:val="1005"/>
+          <w:numId w:val="1007"/>
         </w:numPr>
       </w:pPr>
       <w:r>
@@ -16456,34 +16829,7 @@
     <w:abstractNumId w:val="991"/>
   </w:num>
   <w:num w:numId="1003">
-    <w:abstractNumId w:val="99411"/>
-    <w:lvlOverride w:ilvl="0">
-      <w:startOverride w:val="1"/>
-    </w:lvlOverride>
-    <w:lvlOverride w:ilvl="1">
-      <w:startOverride w:val="1"/>
-    </w:lvlOverride>
-    <w:lvlOverride w:ilvl="2">
-      <w:startOverride w:val="1"/>
-    </w:lvlOverride>
-    <w:lvlOverride w:ilvl="3">
-      <w:startOverride w:val="1"/>
-    </w:lvlOverride>
-    <w:lvlOverride w:ilvl="4">
-      <w:startOverride w:val="1"/>
-    </w:lvlOverride>
-    <w:lvlOverride w:ilvl="5">
-      <w:startOverride w:val="1"/>
-    </w:lvlOverride>
-    <w:lvlOverride w:ilvl="6">
-      <w:startOverride w:val="1"/>
-    </w:lvlOverride>
-    <w:lvlOverride w:ilvl="7">
-      <w:startOverride w:val="1"/>
-    </w:lvlOverride>
-    <w:lvlOverride w:ilvl="8">
-      <w:startOverride w:val="1"/>
-    </w:lvlOverride>
+    <w:abstractNumId w:val="991"/>
   </w:num>
   <w:num w:numId="1004">
     <w:abstractNumId w:val="99411"/>
@@ -16516,6 +16862,66 @@
     </w:lvlOverride>
   </w:num>
   <w:num w:numId="1005">
+    <w:abstractNumId w:val="99411"/>
+    <w:lvlOverride w:ilvl="0">
+      <w:startOverride w:val="1"/>
+    </w:lvlOverride>
+    <w:lvlOverride w:ilvl="1">
+      <w:startOverride w:val="1"/>
+    </w:lvlOverride>
+    <w:lvlOverride w:ilvl="2">
+      <w:startOverride w:val="1"/>
+    </w:lvlOverride>
+    <w:lvlOverride w:ilvl="3">
+      <w:startOverride w:val="1"/>
+    </w:lvlOverride>
+    <w:lvlOverride w:ilvl="4">
+      <w:startOverride w:val="1"/>
+    </w:lvlOverride>
+    <w:lvlOverride w:ilvl="5">
+      <w:startOverride w:val="1"/>
+    </w:lvlOverride>
+    <w:lvlOverride w:ilvl="6">
+      <w:startOverride w:val="1"/>
+    </w:lvlOverride>
+    <w:lvlOverride w:ilvl="7">
+      <w:startOverride w:val="1"/>
+    </w:lvlOverride>
+    <w:lvlOverride w:ilvl="8">
+      <w:startOverride w:val="1"/>
+    </w:lvlOverride>
+  </w:num>
+  <w:num w:numId="1006">
+    <w:abstractNumId w:val="99411"/>
+    <w:lvlOverride w:ilvl="0">
+      <w:startOverride w:val="1"/>
+    </w:lvlOverride>
+    <w:lvlOverride w:ilvl="1">
+      <w:startOverride w:val="1"/>
+    </w:lvlOverride>
+    <w:lvlOverride w:ilvl="2">
+      <w:startOverride w:val="1"/>
+    </w:lvlOverride>
+    <w:lvlOverride w:ilvl="3">
+      <w:startOverride w:val="1"/>
+    </w:lvlOverride>
+    <w:lvlOverride w:ilvl="4">
+      <w:startOverride w:val="1"/>
+    </w:lvlOverride>
+    <w:lvlOverride w:ilvl="5">
+      <w:startOverride w:val="1"/>
+    </w:lvlOverride>
+    <w:lvlOverride w:ilvl="6">
+      <w:startOverride w:val="1"/>
+    </w:lvlOverride>
+    <w:lvlOverride w:ilvl="7">
+      <w:startOverride w:val="1"/>
+    </w:lvlOverride>
+    <w:lvlOverride w:ilvl="8">
+      <w:startOverride w:val="1"/>
+    </w:lvlOverride>
+  </w:num>
+  <w:num w:numId="1007">
     <w:abstractNumId w:val="99411"/>
     <w:lvlOverride w:ilvl="0">
       <w:startOverride w:val="1"/>
@@ -17210,7 +17616,6 @@
     <w:link w:val="VerbatimChar"/>
     <w:pPr>
       <w:wordWrap w:val="off"/>
-      <w:shd w:val="clear" w:fill="f8f8f8"/>
     </w:pPr>
   </w:style>
   <w:style w:type="character" w:customStyle="1" w:styleId="KeywordTok">
@@ -17218,96 +17623,85 @@
     <w:basedOn w:val="VerbatimChar"/>
     <w:rPr>
       <w:b/>
-      <w:color w:val="204a87"/>
-      <w:shd w:val="clear" w:fill="f8f8f8"/>
+      <w:color w:val="007020"/>
     </w:rPr>
   </w:style>
   <w:style w:type="character" w:customStyle="1" w:styleId="DataTypeTok">
     <w:name w:val="DataTypeTok"/>
     <w:basedOn w:val="VerbatimChar"/>
     <w:rPr>
-      <w:color w:val="204a87"/>
-      <w:shd w:val="clear" w:fill="f8f8f8"/>
+      <w:color w:val="902000"/>
     </w:rPr>
   </w:style>
   <w:style w:type="character" w:customStyle="1" w:styleId="DecValTok">
     <w:name w:val="DecValTok"/>
     <w:basedOn w:val="VerbatimChar"/>
     <w:rPr>
-      <w:color w:val="0000cf"/>
-      <w:shd w:val="clear" w:fill="f8f8f8"/>
+      <w:color w:val="40a070"/>
     </w:rPr>
   </w:style>
   <w:style w:type="character" w:customStyle="1" w:styleId="BaseNTok">
     <w:name w:val="BaseNTok"/>
     <w:basedOn w:val="VerbatimChar"/>
     <w:rPr>
-      <w:color w:val="0000cf"/>
-      <w:shd w:val="clear" w:fill="f8f8f8"/>
+      <w:color w:val="40a070"/>
     </w:rPr>
   </w:style>
   <w:style w:type="character" w:customStyle="1" w:styleId="FloatTok">
     <w:name w:val="FloatTok"/>
     <w:basedOn w:val="VerbatimChar"/>
     <w:rPr>
-      <w:color w:val="0000cf"/>
-      <w:shd w:val="clear" w:fill="f8f8f8"/>
+      <w:color w:val="40a070"/>
     </w:rPr>
   </w:style>
   <w:style w:type="character" w:customStyle="1" w:styleId="ConstantTok">
     <w:name w:val="ConstantTok"/>
     <w:basedOn w:val="VerbatimChar"/>
     <w:rPr>
-      <w:color w:val="8f5902"/>
-      <w:shd w:val="clear" w:fill="f8f8f8"/>
+      <w:color w:val="880000"/>
     </w:rPr>
   </w:style>
   <w:style w:type="character" w:customStyle="1" w:styleId="CharTok">
     <w:name w:val="CharTok"/>
     <w:basedOn w:val="VerbatimChar"/>
     <w:rPr>
-      <w:color w:val="4e9a06"/>
-      <w:shd w:val="clear" w:fill="f8f8f8"/>
+      <w:color w:val="4070a0"/>
     </w:rPr>
   </w:style>
   <w:style w:type="character" w:customStyle="1" w:styleId="SpecialCharTok">
     <w:name w:val="SpecialCharTok"/>
     <w:basedOn w:val="VerbatimChar"/>
     <w:rPr>
-      <w:b/>
-      <w:color w:val="ce5c00"/>
-      <w:shd w:val="clear" w:fill="f8f8f8"/>
+      <w:color w:val="4070a0"/>
     </w:rPr>
   </w:style>
   <w:style w:type="character" w:customStyle="1" w:styleId="StringTok">
     <w:name w:val="StringTok"/>
     <w:basedOn w:val="VerbatimChar"/>
     <w:rPr>
-      <w:color w:val="4e9a06"/>
-      <w:shd w:val="clear" w:fill="f8f8f8"/>
+      <w:color w:val="4070a0"/>
     </w:rPr>
   </w:style>
   <w:style w:type="character" w:customStyle="1" w:styleId="VerbatimStringTok">
     <w:name w:val="VerbatimStringTok"/>
     <w:basedOn w:val="VerbatimChar"/>
     <w:rPr>
-      <w:color w:val="4e9a06"/>
-      <w:shd w:val="clear" w:fill="f8f8f8"/>
+      <w:color w:val="4070a0"/>
     </w:rPr>
   </w:style>
   <w:style w:type="character" w:customStyle="1" w:styleId="SpecialStringTok">
     <w:name w:val="SpecialStringTok"/>
     <w:basedOn w:val="VerbatimChar"/>
     <w:rPr>
-      <w:color w:val="4e9a06"/>
-      <w:shd w:val="clear" w:fill="f8f8f8"/>
+      <w:color w:val="bb6688"/>
     </w:rPr>
   </w:style>
   <w:style w:type="character" w:customStyle="1" w:styleId="ImportTok">
     <w:name w:val="ImportTok"/>
     <w:basedOn w:val="VerbatimChar"/>
     <w:rPr>
-      <w:shd w:val="clear" w:fill="f8f8f8"/>
+      <w:b/>
+      <w:color w:val="008000"/>
     </w:rPr>
   </w:style>
   <w:style w:type="character" w:customStyle="1" w:styleId="CommentTok">
@@ -17315,18 +17709,15 @@
     <w:basedOn w:val="VerbatimChar"/>
     <w:rPr>
       <w:i/>
-      <w:color w:val="8f5902"/>
-      <w:shd w:val="clear" w:fill="f8f8f8"/>
+      <w:color w:val="60a0b0"/>
     </w:rPr>
   </w:style>
   <w:style w:type="character" w:customStyle="1" w:styleId="DocumentationTok">
     <w:name w:val="DocumentationTok"/>
     <w:basedOn w:val="VerbatimChar"/>
     <w:rPr>
-      <w:b/>
       <w:i/>
-      <w:color w:val="8f5902"/>
-      <w:shd w:val="clear" w:fill="f8f8f8"/>
+      <w:color w:val="ba2121"/>
     </w:rPr>
   </w:style>
   <w:style w:type="character" w:customStyle="1" w:styleId="AnnotationTok">
@@ -17335,8 +17726,7 @@
     <w:rPr>
       <w:b/>
       <w:i/>
-      <w:color w:val="8f5902"/>
-      <w:shd w:val="clear" w:fill="f8f8f8"/>
+      <w:color w:val="60a0b0"/>
     </w:rPr>
   </w:style>
   <w:style w:type="character" w:customStyle="1" w:styleId="CommentVarTok">
@@ -17345,33 +17735,28 @@
     <w:rPr>
       <w:b/>
       <w:i/>
-      <w:color w:val="8f5902"/>
-      <w:shd w:val="clear" w:fill="f8f8f8"/>
+      <w:color w:val="60a0b0"/>
     </w:rPr>
   </w:style>
   <w:style w:type="character" w:customStyle="1" w:styleId="OtherTok">
     <w:name w:val="OtherTok"/>
     <w:basedOn w:val="VerbatimChar"/>
     <w:rPr>
-      <w:color w:val="8f5902"/>
-      <w:shd w:val="clear" w:fill="f8f8f8"/>
+      <w:color w:val="007020"/>
     </w:rPr>
   </w:style>
   <w:style w:type="character" w:customStyle="1" w:styleId="FunctionTok">
     <w:name w:val="FunctionTok"/>
     <w:basedOn w:val="VerbatimChar"/>
     <w:rPr>
-      <w:b/>
-      <w:color w:val="204a87"/>
-      <w:shd w:val="clear" w:fill="f8f8f8"/>
+      <w:color w:val="06287e"/>
     </w:rPr>
   </w:style>
   <w:style w:type="character" w:customStyle="1" w:styleId="VariableTok">
     <w:name w:val="VariableTok"/>
     <w:basedOn w:val="VerbatimChar"/>
     <w:rPr>
-      <w:color w:val="000000"/>
-      <w:shd w:val="clear" w:fill="f8f8f8"/>
+      <w:color w:val="19177c"/>
     </w:rPr>
   </w:style>
   <w:style w:type="character" w:customStyle="1" w:styleId="ControlFlowTok">
@@ -17379,56 +17764,46 @@
     <w:basedOn w:val="VerbatimChar"/>
     <w:rPr>
       <w:b/>
-      <w:color w:val="204a87"/>
-      <w:shd w:val="clear" w:fill="f8f8f8"/>
+      <w:color w:val="007020"/>
     </w:rPr>
   </w:style>
   <w:style w:type="character" w:customStyle="1" w:styleId="OperatorTok">
     <w:name w:val="OperatorTok"/>
     <w:basedOn w:val="VerbatimChar"/>
     <w:rPr>
-      <w:b/>
-      <w:color w:val="ce5c00"/>
-      <w:shd w:val="clear" w:fill="f8f8f8"/>
+      <w:color w:val="666666"/>
     </w:rPr>
   </w:style>
   <w:style w:type="character" w:customStyle="1" w:styleId="BuiltInTok">
     <w:name w:val="BuiltInTok"/>
     <w:basedOn w:val="VerbatimChar"/>
     <w:rPr>
-      <w:shd w:val="clear" w:fill="f8f8f8"/>
+      <w:color w:val="008000"/>
     </w:rPr>
   </w:style>
   <w:style w:type="character" w:customStyle="1" w:styleId="ExtensionTok">
     <w:name w:val="ExtensionTok"/>
     <w:basedOn w:val="VerbatimChar"/>
-    <w:rPr>
-      <w:shd w:val="clear" w:fill="f8f8f8"/>
-    </w:rPr>
+    <w:rPr/>
   </w:style>
   <w:style w:type="character" w:customStyle="1" w:styleId="PreprocessorTok">
     <w:name w:val="PreprocessorTok"/>
     <w:basedOn w:val="VerbatimChar"/>
     <w:rPr>
-      <w:i/>
-      <w:color w:val="8f5902"/>
-      <w:shd w:val="clear" w:fill="f8f8f8"/>
+      <w:color w:val="bc7a00"/>
     </w:rPr>
   </w:style>
   <w:style w:type="character" w:customStyle="1" w:styleId="AttributeTok">
     <w:name w:val="AttributeTok"/>
     <w:basedOn w:val="VerbatimChar"/>
     <w:rPr>
-      <w:color w:val="204a87"/>
-      <w:shd w:val="clear" w:fill="f8f8f8"/>
+      <w:color w:val="7d9029"/>
     </w:rPr>
   </w:style>
   <w:style w:type="character" w:customStyle="1" w:styleId="RegionMarkerTok">
     <w:name w:val="RegionMarkerTok"/>
     <w:basedOn w:val="VerbatimChar"/>
-    <w:rPr>
-      <w:shd w:val="clear" w:fill="f8f8f8"/>
-    </w:rPr>
+    <w:rPr/>
   </w:style>
   <w:style w:type="character" w:customStyle="1" w:styleId="InformationTok">
     <w:name w:val="InformationTok"/>
@@ -17436,8 +17811,7 @@
     <w:rPr>
       <w:b/>
       <w:i/>
-      <w:color w:val="8f5902"/>
-      <w:shd w:val="clear" w:fill="f8f8f8"/>
+      <w:color w:val="60a0b0"/>
     </w:rPr>
   </w:style>
   <w:style w:type="character" w:customStyle="1" w:styleId="WarningTok">
@@ -17446,16 +17820,15 @@
     <w:rPr>
       <w:b/>
       <w:i/>
-      <w:color w:val="8f5902"/>
-      <w:shd w:val="clear" w:fill="f8f8f8"/>
+      <w:color w:val="60a0b0"/>
     </w:rPr>
   </w:style>
   <w:style w:type="character" w:customStyle="1" w:styleId="AlertTok">
     <w:name w:val="AlertTok"/>
     <w:basedOn w:val="VerbatimChar"/>
     <w:rPr>
-      <w:color w:val="ef2929"/>
-      <w:shd w:val="clear" w:fill="f8f8f8"/>
+      <w:b/>
+      <w:color w:val="ff0000"/>
     </w:rPr>
   </w:style>
   <w:style w:type="character" w:customStyle="1" w:styleId="ErrorTok">
@@ -17463,16 +17836,13 @@
     <w:basedOn w:val="VerbatimChar"/>
     <w:rPr>
       <w:b/>
-      <w:color w:val="a40000"/>
-      <w:shd w:val="clear" w:fill="f8f8f8"/>
+      <w:color w:val="ff0000"/>
     </w:rPr>
   </w:style>
   <w:style w:type="character" w:customStyle="1" w:styleId="NormalTok">
     <w:name w:val="NormalTok"/>
     <w:basedOn w:val="VerbatimChar"/>
-    <w:rPr>
-      <w:shd w:val="clear" w:fill="f8f8f8"/>
-    </w:rPr>
+    <w:rPr/>
   </w:style>
 </w:styles>
 </file>

</xml_diff>